<commit_message>
Remove the visit checklist section from the research briefing
Section 7 (questions to raise during the visit and the pre-visit
internal checks) is dropped, together with the cross-references to it
and to the cautions section removed from the talking points.

Co-Authored-By: Claude Opus 5.5 <noreply@anthropic.com>
Claude-Session: https://claude.ai/code/session_01DwyReAbHuerDM9qQp6F7Yx
</commit_message>
<xml_diff>
--- a/research-asean-china-ai-ko.docx
+++ b/research-asean-china-ai-ko.docx
@@ -212,7 +212,7 @@
         <w:t xml:space="preserve">판단의 한계</w:t>
       </w:r>
       <w:r>
-        <w:t xml:space="preserve">: 본문의 "확인되지 않는다"는 "공개 자료에서 찾지 못했다"는 뜻이며, 부재를 입증하지 않는다. 7장의 확인 사항은 이 한계를 메우기 위한 것이다.</w:t>
+        <w:t xml:space="preserve">: 본문의 "확인되지 않는다"는 "공개 자료에서 찾지 못했다"는 뜻이며, 부재를 입증하지 않는다.</w:t>
       </w:r>
     </w:p>
     <w:p>
@@ -3830,7 +3830,7 @@
     <w:p>
       <w:pPr/>
       <w:r>
-        <w:t xml:space="preserve">이번 방문에서는 CIIS 라운드테이블 2세션이 첫 실행 기회다. 교육부 면담에서는 A1·A2를 소개하며 Smart Education의 대상과 협의 채널을 확인하는 데 그친다(7장 1–3번). 두 트랙의 논리는 같다. AI를 현장까지 전달하는 망과, 연수 이후의 활용을 보여 주는 근거를 ASEAN이 갖고 있다는 것이다.</w:t>
+        <w:t xml:space="preserve">이번 방문에서는 CIIS 라운드테이블 2세션이 첫 실행 기회다. 교육부 면담에서는 A1·A2를 소개하며 Smart Education의 대상과 협의 채널을 확인하는 데 그친다. 두 트랙의 논리는 같다. AI를 현장까지 전달하는 망과, 연수 이후의 활용을 보여 주는 근거를 ASEAN이 갖고 있다는 것이다.</w:t>
       </w:r>
     </w:p>
     <w:p>
@@ -5237,7 +5237,7 @@
         <w:t xml:space="preserve">교사 트랙(C1, 진입은 A1·A2)</w:t>
       </w:r>
       <w:r>
-        <w:t xml:space="preserve">: SOM-ED가 승인한 사업과 직결된다. Smart Education의 교사 포함 여부(7장 1번)를 확인하고 SOM-ED에 보고한 뒤 추진한다.</w:t>
+        <w:t xml:space="preserve">: SOM-ED가 승인한 사업과 직결된다. Smart Education의 교사 포함 여부를 확인하고 SOM-ED에 보고한 뒤 추진한다.</w:t>
       </w:r>
     </w:p>
     <w:p>
@@ -5709,7 +5709,7 @@
           <w:p>
             <w:pPr/>
             <w:r>
-              <w:t xml:space="preserve">재단 경험 중심으로 말하고, ASEAN 입장 대변이나 특정 구상 지지 표현은 피한다(발언 요지 문서 7장)</w:t>
+              <w:t xml:space="preserve">재단 경험 중심으로 말하고, ASEAN 입장 대변이나 특정 구상 지지 표현은 피한다</w:t>
             </w:r>
           </w:p>
         </w:tc>
@@ -6006,779 +6006,22 @@
         <w:pStyle w:val="Heading2"/>
       </w:pPr>
       <w:r>
-        <w:t xml:space="preserve">7. 방문 중 확인 사항</w:t>
+        <w:t xml:space="preserve">부록: 출처</w:t>
       </w:r>
     </w:p>
     <w:p>
       <w:pPr/>
       <w:r>
-        <w:t xml:space="preserve">현지에서 확인할 질문은 각각 5장의 어느 옵션을 살리거나 접을지 결정하도록 구성했다. 5·6·14번은 MSME 트랙, 1–3번은 교사 트랙(C1)의 전제다.</w:t>
-      </w:r>
-    </w:p>
-    <w:tbl>
-      <w:tblPr>
-        <w:tblStyle w:val="TableGrid"/>
-        <w:tblW w:w="0" w:type="auto"/>
-        <w:tblLayout w:type="fixed"/>
-        <w:tblLook w:val="04A0" w:firstRow="1" w:lastRow="0" w:firstColumn="0" w:lastColumn="0" w:noHBand="0" w:noVBand="1"/>
-      </w:tblPr>
-      <w:tblGrid>
-        <w:gridCol w:w="2340"/>
-        <w:gridCol w:w="2340"/>
-        <w:gridCol w:w="2340"/>
-        <w:gridCol w:w="2340"/>
-      </w:tblGrid>
-      <w:tr>
-        <w:trPr>
-          <w:tblHeader/>
-        </w:trPr>
-        <w:tc>
-          <w:tcPr>
-            <w:tcW w:w="2340" w:type="dxa"/>
-            <w:shd w:val="clear" w:color="auto" w:fill="F2F2F2"/>
-          </w:tcPr>
-          <w:p>
-            <w:pPr/>
-            <w:r>
-              <w:t xml:space="preserve">#</w:t>
-            </w:r>
-          </w:p>
-        </w:tc>
-        <w:tc>
-          <w:tcPr>
-            <w:tcW w:w="2340" w:type="dxa"/>
-            <w:shd w:val="clear" w:color="auto" w:fill="F2F2F2"/>
-          </w:tcPr>
-          <w:p>
-            <w:pPr/>
-            <w:r>
-              <w:t xml:space="preserve">질문</w:t>
-            </w:r>
-          </w:p>
-        </w:tc>
-        <w:tc>
-          <w:tcPr>
-            <w:tcW w:w="2340" w:type="dxa"/>
-            <w:shd w:val="clear" w:color="auto" w:fill="F2F2F2"/>
-          </w:tcPr>
-          <w:p>
-            <w:pPr/>
-            <w:r>
-              <w:t xml:space="preserve">상대</w:t>
-            </w:r>
-          </w:p>
-        </w:tc>
-        <w:tc>
-          <w:tcPr>
-            <w:tcW w:w="2340" w:type="dxa"/>
-            <w:shd w:val="clear" w:color="auto" w:fill="F2F2F2"/>
-          </w:tcPr>
-          <w:p>
-            <w:pPr/>
-            <w:r>
-              <w:t xml:space="preserve">관련 옵션</w:t>
-            </w:r>
-          </w:p>
-        </w:tc>
-      </w:tr>
-      <w:tr>
-        <w:tc>
-          <w:tcPr>
-            <w:tcW w:w="2340" w:type="dxa"/>
-          </w:tcPr>
-          <w:p>
-            <w:pPr/>
-            <w:r>
-              <w:t xml:space="preserve">1</w:t>
-            </w:r>
-          </w:p>
-        </w:tc>
-        <w:tc>
-          <w:tcPr>
-            <w:tcW w:w="2340" w:type="dxa"/>
-          </w:tcPr>
-          <w:p>
-            <w:pPr/>
-            <w:r>
-              <w:t xml:space="preserve">Smart Education Capacity Building Project('AI+교육' 연계)의 대상에 초중등 교사가 포함되는가. AI 교육과정, 참여 회원국, 이행 기관은 어디인가</w:t>
-            </w:r>
-          </w:p>
-        </w:tc>
-        <w:tc>
-          <w:tcPr>
-            <w:tcW w:w="2340" w:type="dxa"/>
-          </w:tcPr>
-          <w:p>
-            <w:pPr/>
-            <w:r>
-              <w:t xml:space="preserve">중국 교육부, 사업 실무진</w:t>
-            </w:r>
-          </w:p>
-        </w:tc>
-        <w:tc>
-          <w:tcPr>
-            <w:tcW w:w="2340" w:type="dxa"/>
-          </w:tcPr>
-          <w:p>
-            <w:pPr/>
-            <w:r>
-              <w:t xml:space="preserve">C1, A1</w:t>
-            </w:r>
-          </w:p>
-        </w:tc>
-      </w:tr>
-      <w:tr>
-        <w:tc>
-          <w:tcPr>
-            <w:tcW w:w="2340" w:type="dxa"/>
-          </w:tcPr>
-          <w:p>
-            <w:pPr/>
-            <w:r>
-              <w:t xml:space="preserve">2</w:t>
-            </w:r>
-          </w:p>
-        </w:tc>
-        <w:tc>
-          <w:tcPr>
-            <w:tcW w:w="2340" w:type="dxa"/>
-          </w:tcPr>
-          <w:p>
-            <w:pPr/>
-            <w:r>
-              <w:t xml:space="preserve">교사 AI 연수를 확대할 때 외부의 현지어 AI 콘텐츠나 트레이너망과 연계할 여지가 있는가</w:t>
-            </w:r>
-          </w:p>
-        </w:tc>
-        <w:tc>
-          <w:tcPr>
-            <w:tcW w:w="2340" w:type="dxa"/>
-          </w:tcPr>
-          <w:p>
-            <w:pPr/>
-            <w:r>
-              <w:t xml:space="preserve">위와 동일</w:t>
-            </w:r>
-          </w:p>
-        </w:tc>
-        <w:tc>
-          <w:tcPr>
-            <w:tcW w:w="2340" w:type="dxa"/>
-          </w:tcPr>
-          <w:p>
-            <w:pPr/>
-            <w:r>
-              <w:t xml:space="preserve">C1, B1</w:t>
-            </w:r>
-          </w:p>
-        </w:tc>
-      </w:tr>
-      <w:tr>
-        <w:tc>
-          <w:tcPr>
-            <w:tcW w:w="2340" w:type="dxa"/>
-          </w:tcPr>
-          <w:p>
-            <w:pPr/>
-            <w:r>
-              <w:t xml:space="preserve">3</w:t>
-            </w:r>
-          </w:p>
-        </w:tc>
-        <w:tc>
-          <w:tcPr>
-            <w:tcW w:w="2340" w:type="dxa"/>
-          </w:tcPr>
-          <w:p>
-            <w:pPr/>
-            <w:r>
-              <w:t xml:space="preserve">중국 측은 ASEAN 교육 부문(SOM-ED)과 어떤 협의 채널을 두고 있는가</w:t>
-            </w:r>
-          </w:p>
-        </w:tc>
-        <w:tc>
-          <w:tcPr>
-            <w:tcW w:w="2340" w:type="dxa"/>
-          </w:tcPr>
-          <w:p>
-            <w:pPr/>
-            <w:r>
-              <w:t xml:space="preserve">중국 교육부, 주ASEAN 중국대표부</w:t>
-            </w:r>
-          </w:p>
-        </w:tc>
-        <w:tc>
-          <w:tcPr>
-            <w:tcW w:w="2340" w:type="dxa"/>
-          </w:tcPr>
-          <w:p>
-            <w:pPr/>
-            <w:r>
-              <w:t xml:space="preserve">C1</w:t>
-            </w:r>
-          </w:p>
-        </w:tc>
-      </w:tr>
-      <w:tr>
-        <w:tc>
-          <w:tcPr>
-            <w:tcW w:w="2340" w:type="dxa"/>
-          </w:tcPr>
-          <w:p>
-            <w:pPr/>
-            <w:r>
-              <w:t xml:space="preserve">4</w:t>
-            </w:r>
-          </w:p>
-        </w:tc>
-        <w:tc>
-          <w:tcPr>
-            <w:tcW w:w="2340" w:type="dxa"/>
-          </w:tcPr>
-          <w:p>
-            <w:pPr/>
-            <w:r>
-              <w:t xml:space="preserve">혁신센터 AI 연수와 Digital Academy의 교육과정·선발 기준은 무엇이며, 사전 학습이나 외부 콘텐츠 연계를 받아들이는가</w:t>
-            </w:r>
-          </w:p>
-        </w:tc>
-        <w:tc>
-          <w:tcPr>
-            <w:tcW w:w="2340" w:type="dxa"/>
-          </w:tcPr>
-          <w:p>
-            <w:pPr/>
-            <w:r>
-              <w:t xml:space="preserve">공업정보화부, 센터·Academy 운영 측</w:t>
-            </w:r>
-          </w:p>
-        </w:tc>
-        <w:tc>
-          <w:tcPr>
-            <w:tcW w:w="2340" w:type="dxa"/>
-          </w:tcPr>
-          <w:p>
-            <w:pPr/>
-            <w:r>
-              <w:t xml:space="preserve">B1, A1</w:t>
-            </w:r>
-          </w:p>
-        </w:tc>
-      </w:tr>
-      <w:tr>
-        <w:tc>
-          <w:tcPr>
-            <w:tcW w:w="2340" w:type="dxa"/>
-          </w:tcPr>
-          <w:p>
-            <w:pPr/>
-            <w:r>
-              <w:t xml:space="preserve">5</w:t>
-            </w:r>
-          </w:p>
-        </w:tc>
-        <w:tc>
-          <w:tcPr>
-            <w:tcW w:w="2340" w:type="dxa"/>
-          </w:tcPr>
-          <w:p>
-            <w:pPr/>
-            <w:r>
-              <w:t xml:space="preserve">혁신센터와 광시 분소에 MSME 대상 AI 연수 계획이 있는가. MSME 중개자(협회·현지 트레이너)에게 열 여지는</w:t>
-            </w:r>
-          </w:p>
-        </w:tc>
-        <w:tc>
-          <w:tcPr>
-            <w:tcW w:w="2340" w:type="dxa"/>
-          </w:tcPr>
-          <w:p>
-            <w:pPr/>
-            <w:r>
-              <w:t xml:space="preserve">공업정보화부, 센터 운영 측</w:t>
-            </w:r>
-          </w:p>
-        </w:tc>
-        <w:tc>
-          <w:tcPr>
-            <w:tcW w:w="2340" w:type="dxa"/>
-          </w:tcPr>
-          <w:p>
-            <w:pPr/>
-            <w:r>
-              <w:t xml:space="preserve">A3, C5</w:t>
-            </w:r>
-          </w:p>
-        </w:tc>
-      </w:tr>
-      <w:tr>
-        <w:tc>
-          <w:tcPr>
-            <w:tcW w:w="2340" w:type="dxa"/>
-          </w:tcPr>
-          <w:p>
-            <w:pPr/>
-            <w:r>
-              <w:t xml:space="preserve">6</w:t>
-            </w:r>
-          </w:p>
-        </w:tc>
-        <w:tc>
-          <w:tcPr>
-            <w:tcW w:w="2340" w:type="dxa"/>
-          </w:tcPr>
-          <w:p>
-            <w:pPr/>
-            <w:r>
-              <w:t xml:space="preserve">5,000건 AI 연수 가운데 ASEAN 배정 규모, 대상, 형식, 성과 측정 방식은</w:t>
-            </w:r>
-          </w:p>
-        </w:tc>
-        <w:tc>
-          <w:tcPr>
-            <w:tcW w:w="2340" w:type="dxa"/>
-          </w:tcPr>
-          <w:p>
-            <w:pPr/>
-            <w:r>
-              <w:t xml:space="preserve">중국 외교부, 주ASEAN 중국대표부</w:t>
-            </w:r>
-          </w:p>
-        </w:tc>
-        <w:tc>
-          <w:tcPr>
-            <w:tcW w:w="2340" w:type="dxa"/>
-          </w:tcPr>
-          <w:p>
-            <w:pPr/>
-            <w:r>
-              <w:t xml:space="preserve">D1, A2</w:t>
-            </w:r>
-          </w:p>
-        </w:tc>
-      </w:tr>
-      <w:tr>
-        <w:tc>
-          <w:tcPr>
-            <w:tcW w:w="2340" w:type="dxa"/>
-          </w:tcPr>
-          <w:p>
-            <w:pPr/>
-            <w:r>
-              <w:t xml:space="preserve">7</w:t>
-            </w:r>
-          </w:p>
-        </w:tc>
-        <w:tc>
-          <w:tcPr>
-            <w:tcW w:w="2340" w:type="dxa"/>
-          </w:tcPr>
-          <w:p>
-            <w:pPr/>
-            <w:r>
-              <w:t xml:space="preserve">2027 AI 협력의 해: 제안 주체, 11월 정상회의 채택 전망, 예상 결과물에 AI 인재·리터러시가 들어가는가</w:t>
-            </w:r>
-          </w:p>
-        </w:tc>
-        <w:tc>
-          <w:tcPr>
-            <w:tcW w:w="2340" w:type="dxa"/>
-          </w:tcPr>
-          <w:p>
-            <w:pPr/>
-            <w:r>
-              <w:t xml:space="preserve">중국 외교부, 주ASEAN 중국대표부</w:t>
-            </w:r>
-          </w:p>
-        </w:tc>
-        <w:tc>
-          <w:tcPr>
-            <w:tcW w:w="2340" w:type="dxa"/>
-          </w:tcPr>
-          <w:p>
-            <w:pPr/>
-            <w:r>
-              <w:t xml:space="preserve">C3</w:t>
-            </w:r>
-          </w:p>
-        </w:tc>
-      </w:tr>
-      <w:tr>
-        <w:tc>
-          <w:tcPr>
-            <w:tcW w:w="2340" w:type="dxa"/>
-          </w:tcPr>
-          <w:p>
-            <w:pPr/>
-            <w:r>
-              <w:t xml:space="preserve">8</w:t>
-            </w:r>
-          </w:p>
-        </w:tc>
-        <w:tc>
-          <w:tcPr>
-            <w:tcW w:w="2340" w:type="dxa"/>
-          </w:tcPr>
-          <w:p>
-            <w:pPr/>
-            <w:r>
-              <w:t xml:space="preserve">ASEAN–중국 협력기금(ACCF)의 우선 분야와 제안 절차, ASEAN 기구의 사업 수행 가능성</w:t>
-            </w:r>
-          </w:p>
-        </w:tc>
-        <w:tc>
-          <w:tcPr>
-            <w:tcW w:w="2340" w:type="dxa"/>
-          </w:tcPr>
-          <w:p>
-            <w:pPr/>
-            <w:r>
-              <w:t xml:space="preserve">주ASEAN 중국대표부, ASEAN 사무국</w:t>
-            </w:r>
-          </w:p>
-        </w:tc>
-        <w:tc>
-          <w:tcPr>
-            <w:tcW w:w="2340" w:type="dxa"/>
-          </w:tcPr>
-          <w:p>
-            <w:pPr/>
-            <w:r>
-              <w:t xml:space="preserve">C3</w:t>
-            </w:r>
-          </w:p>
-        </w:tc>
-      </w:tr>
-      <w:tr>
-        <w:tc>
-          <w:tcPr>
-            <w:tcW w:w="2340" w:type="dxa"/>
-          </w:tcPr>
-          <w:p>
-            <w:pPr/>
-            <w:r>
-              <w:t xml:space="preserve">9</w:t>
-            </w:r>
-          </w:p>
-        </w:tc>
-        <w:tc>
-          <w:tcPr>
-            <w:tcW w:w="2340" w:type="dxa"/>
-          </w:tcPr>
-          <w:p>
-            <w:pPr/>
-            <w:r>
-              <w:t xml:space="preserve">난닝 응용협력센터의 AI 사업 현장에 사용자 교육 요소가 있는가</w:t>
-            </w:r>
-          </w:p>
-        </w:tc>
-        <w:tc>
-          <w:tcPr>
-            <w:tcW w:w="2340" w:type="dxa"/>
-          </w:tcPr>
-          <w:p>
-            <w:pPr/>
-            <w:r>
-              <w:t xml:space="preserve">응용협력센터, 광시 측</w:t>
-            </w:r>
-          </w:p>
-        </w:tc>
-        <w:tc>
-          <w:tcPr>
-            <w:tcW w:w="2340" w:type="dxa"/>
-          </w:tcPr>
-          <w:p>
-            <w:pPr/>
-            <w:r>
-              <w:t xml:space="preserve">C2</w:t>
-            </w:r>
-          </w:p>
-        </w:tc>
-      </w:tr>
-      <w:tr>
-        <w:tc>
-          <w:tcPr>
-            <w:tcW w:w="2340" w:type="dxa"/>
-          </w:tcPr>
-          <w:p>
-            <w:pPr/>
-            <w:r>
-              <w:t xml:space="preserve">10</w:t>
-            </w:r>
-          </w:p>
-        </w:tc>
-        <w:tc>
-          <w:tcPr>
-            <w:tcW w:w="2340" w:type="dxa"/>
-          </w:tcPr>
-          <w:p>
-            <w:pPr/>
-            <w:r>
-              <w:t xml:space="preserve">AI 윤리·안전 협력 이니셔티브(2026.9)의 내용은 무엇이며, 사용자 AI 리터러시가 포함되는가</w:t>
-            </w:r>
-          </w:p>
-        </w:tc>
-        <w:tc>
-          <w:tcPr>
-            <w:tcW w:w="2340" w:type="dxa"/>
-          </w:tcPr>
-          <w:p>
-            <w:pPr/>
-            <w:r>
-              <w:t xml:space="preserve">국가발전개혁위원회, 참여 회원국</w:t>
-            </w:r>
-          </w:p>
-        </w:tc>
-        <w:tc>
-          <w:tcPr>
-            <w:tcW w:w="2340" w:type="dxa"/>
-          </w:tcPr>
-          <w:p>
-            <w:pPr/>
-            <w:r>
-              <w:t xml:space="preserve">B2</w:t>
-            </w:r>
-          </w:p>
-        </w:tc>
-      </w:tr>
-      <w:tr>
-        <w:tc>
-          <w:tcPr>
-            <w:tcW w:w="2340" w:type="dxa"/>
-          </w:tcPr>
-          <w:p>
-            <w:pPr/>
-            <w:r>
-              <w:t xml:space="preserve">11</w:t>
-            </w:r>
-          </w:p>
-        </w:tc>
-        <w:tc>
-          <w:tcPr>
-            <w:tcW w:w="2340" w:type="dxa"/>
-          </w:tcPr>
-          <w:p>
-            <w:pPr/>
-            <w:r>
-              <w:t xml:space="preserve">라오스 국가 언어모델과 ASEAN AI 오픈소스 커뮤니티의 참여 방식과 데이터 정책은</w:t>
-            </w:r>
-          </w:p>
-        </w:tc>
-        <w:tc>
-          <w:tcPr>
-            <w:tcW w:w="2340" w:type="dxa"/>
-          </w:tcPr>
-          <w:p>
-            <w:pPr/>
-            <w:r>
-              <w:t xml:space="preserve">국가발전개혁위원회·광시 측</w:t>
-            </w:r>
-          </w:p>
-        </w:tc>
-        <w:tc>
-          <w:tcPr>
-            <w:tcW w:w="2340" w:type="dxa"/>
-          </w:tcPr>
-          <w:p>
-            <w:pPr/>
-            <w:r>
-              <w:t xml:space="preserve">B3</w:t>
-            </w:r>
-          </w:p>
-        </w:tc>
-      </w:tr>
-      <w:tr>
-        <w:tc>
-          <w:tcPr>
-            <w:tcW w:w="2340" w:type="dxa"/>
-          </w:tcPr>
-          <w:p>
-            <w:pPr/>
-            <w:r>
-              <w:t xml:space="preserve">12</w:t>
-            </w:r>
-          </w:p>
-        </w:tc>
-        <w:tc>
-          <w:tcPr>
-            <w:tcW w:w="2340" w:type="dxa"/>
-          </w:tcPr>
-          <w:p>
-            <w:pPr/>
-            <w:r>
-              <w:t xml:space="preserve">CIIS는 라운드테이블 결과를 보고서나 정책 건의로 묶는가. 후속 공동 연구의 여지는</w:t>
-            </w:r>
-          </w:p>
-        </w:tc>
-        <w:tc>
-          <w:tcPr>
-            <w:tcW w:w="2340" w:type="dxa"/>
-          </w:tcPr>
-          <w:p>
-            <w:pPr/>
-            <w:r>
-              <w:t xml:space="preserve">CIIS 아태연구소</w:t>
-            </w:r>
-          </w:p>
-        </w:tc>
-        <w:tc>
-          <w:tcPr>
-            <w:tcW w:w="2340" w:type="dxa"/>
-          </w:tcPr>
-          <w:p>
-            <w:pPr/>
-            <w:r>
-              <w:t xml:space="preserve">A2, D1</w:t>
-            </w:r>
-          </w:p>
-        </w:tc>
-      </w:tr>
-      <w:tr>
-        <w:tc>
-          <w:tcPr>
-            <w:tcW w:w="2340" w:type="dxa"/>
-          </w:tcPr>
-          <w:p>
-            <w:pPr/>
-            <w:r>
-              <w:t xml:space="preserve">13</w:t>
-            </w:r>
-          </w:p>
-        </w:tc>
-        <w:tc>
-          <w:tcPr>
-            <w:tcW w:w="2340" w:type="dxa"/>
-          </w:tcPr>
-          <w:p>
-            <w:pPr/>
-            <w:r>
-              <w:t xml:space="preserve">중국 측은 ASEAN Foundation과 AI Ready ASEAN·AIM ASEAN을 어떻게 인식하는가(민간 재원, Google AI 도구 활용 포함)</w:t>
-            </w:r>
-          </w:p>
-        </w:tc>
-        <w:tc>
-          <w:tcPr>
-            <w:tcW w:w="2340" w:type="dxa"/>
-          </w:tcPr>
-          <w:p>
-            <w:pPr/>
-            <w:r>
-              <w:t xml:space="preserve">면담 상대 전반</w:t>
-            </w:r>
-          </w:p>
-        </w:tc>
-        <w:tc>
-          <w:tcPr>
-            <w:tcW w:w="2340" w:type="dxa"/>
-          </w:tcPr>
-          <w:p>
-            <w:pPr/>
-            <w:r>
-              <w:t xml:space="preserve">6장 리스크</w:t>
-            </w:r>
-          </w:p>
-        </w:tc>
-      </w:tr>
-      <w:tr>
-        <w:tc>
-          <w:tcPr>
-            <w:tcW w:w="2340" w:type="dxa"/>
-          </w:tcPr>
-          <w:p>
-            <w:pPr/>
-            <w:r>
-              <w:t xml:space="preserve">14</w:t>
-            </w:r>
-          </w:p>
-        </w:tc>
-        <w:tc>
-          <w:tcPr>
-            <w:tcW w:w="2340" w:type="dxa"/>
-          </w:tcPr>
-          <w:p>
-            <w:pPr/>
-            <w:r>
-              <w:t xml:space="preserve">혁신센터·광시 분소 연수에 연수 이후 지원(현장 적용 상담, 후속 과정)이 있는가. 성과는 무엇으로 측정하는가</w:t>
-            </w:r>
-          </w:p>
-        </w:tc>
-        <w:tc>
-          <w:tcPr>
-            <w:tcW w:w="2340" w:type="dxa"/>
-          </w:tcPr>
-          <w:p>
-            <w:pPr/>
-            <w:r>
-              <w:t xml:space="preserve">공업정보화부, 센터 운영 측</w:t>
-            </w:r>
-          </w:p>
-        </w:tc>
-        <w:tc>
-          <w:tcPr>
-            <w:tcW w:w="2340" w:type="dxa"/>
-          </w:tcPr>
-          <w:p>
-            <w:pPr/>
-            <w:r>
-              <w:t xml:space="preserve">D1, B4, C5</w:t>
-            </w:r>
-          </w:p>
-        </w:tc>
-      </w:tr>
-      <w:tr>
-        <w:tc>
-          <w:tcPr>
-            <w:tcW w:w="2340" w:type="dxa"/>
-          </w:tcPr>
-          <w:p>
-            <w:pPr/>
-            <w:r>
-              <w:t xml:space="preserve">15</w:t>
-            </w:r>
-          </w:p>
-        </w:tc>
-        <w:tc>
-          <w:tcPr>
-            <w:tcW w:w="2340" w:type="dxa"/>
-          </w:tcPr>
-          <w:p>
-            <w:pPr/>
-            <w:r>
-              <w:t xml:space="preserve">ASEAN–중국 AI 사례집(2026.9)의 작성 기준은 무엇이며, MSME 사례가 들어갈 여지가 있는가</w:t>
-            </w:r>
-          </w:p>
-        </w:tc>
-        <w:tc>
-          <w:tcPr>
-            <w:tcW w:w="2340" w:type="dxa"/>
-          </w:tcPr>
-          <w:p>
-            <w:pPr/>
-            <w:r>
-              <w:t xml:space="preserve">국가발전개혁위원회·광시 측</w:t>
-            </w:r>
-          </w:p>
-        </w:tc>
-        <w:tc>
-          <w:tcPr>
-            <w:tcW w:w="2340" w:type="dxa"/>
-          </w:tcPr>
-          <w:p>
-            <w:pPr/>
-            <w:r>
-              <w:t xml:space="preserve">A4</w:t>
-            </w:r>
-          </w:p>
-        </w:tc>
-      </w:tr>
-    </w:tbl>
+        <w:t xml:space="preserve">본문에 쓴 사실의 출처다. 공개 자료는 2026년 10월 14일 기준이며, 대외 인용 전에는 원문과 대조한다. 싱가포르 Convening 자료는 현지 이행 파트너의 내부 보고서이므로 공개 범위를 확인한 뒤 인용한다. 중국 관영 매체가 유일한 출처인 수치(응용협력센터 실적, 사례집)와 플랫폼·기업 조사(Lazada–Kantar)는 출처를 밝혀 인용한다.</w:t>
+      </w:r>
+    </w:p>
     <w:p>
       <w:pPr/>
       <w:r>
         <w:rPr>
           <w:b/>
         </w:rPr>
-        <w:t xml:space="preserve">방문 전 내부 점검</w:t>
+        <w:t xml:space="preserve">ASEAN–중국 AI 합의·기관</w:t>
       </w:r>
     </w:p>
     <w:p>
@@ -6787,149 +6030,6 @@
         <w:numPr>
           <w:ilvl w:val="0"/>
           <w:numId w:val="12"/>
-        </w:numPr>
-      </w:pPr>
-      <w:r>
-        <w:t xml:space="preserve">☐ Google.org·AVPN·ADB 약정의 AI 콘텐츠 공유·제3자 협력 허용 범위 확인</w:t>
-      </w:r>
-    </w:p>
-    <w:p>
-      <w:pPr>
-        <w:pStyle w:val="ListParagraph"/>
-        <w:numPr>
-          <w:ilvl w:val="0"/>
-          <w:numId w:val="12"/>
-        </w:numPr>
-      </w:pPr>
-      <w:r>
-        <w:t xml:space="preserve">☐ AIM ASEAN의 'Google AI 도구군 활용' 범위와 기술 중립 설명 문안 준비(싱가포르의 '모델 유형 단일 선호 없음' 기록 활용)</w:t>
-      </w:r>
-    </w:p>
-    <w:p>
-      <w:pPr>
-        <w:pStyle w:val="ListParagraph"/>
-        <w:numPr>
-          <w:ilvl w:val="0"/>
-          <w:numId w:val="12"/>
-        </w:numPr>
-      </w:pPr>
-      <w:r>
-        <w:t xml:space="preserve">☐ 싱가포르 후속 계획에서 재단이 맡을 역할(공통 성과 지표, 지역 공유 채널, 템플릿) 내부 합의, LIP 최종 보고서 확정 시점 확인</w:t>
-      </w:r>
-    </w:p>
-    <w:p>
-      <w:pPr>
-        <w:pStyle w:val="ListParagraph"/>
-        <w:numPr>
-          <w:ilvl w:val="0"/>
-          <w:numId w:val="12"/>
-        </w:numPr>
-      </w:pPr>
-      <w:r>
-        <w:t xml:space="preserve">☐ 싱가포르 사례(식품 제조사, 전직 중의사)의 비식별 공개 사용 가능 여부를 Project Asia Data에 확인</w:t>
-      </w:r>
-    </w:p>
-    <w:p>
-      <w:pPr>
-        <w:pStyle w:val="ListParagraph"/>
-        <w:numPr>
-          <w:ilvl w:val="0"/>
-          <w:numId w:val="12"/>
-        </w:numPr>
-      </w:pPr>
-      <w:r>
-        <w:t xml:space="preserve">☐ AI Class ASEAN의 라이선스 조건과 지원 언어 수(9개인가 10개인가) 확정</w:t>
-      </w:r>
-    </w:p>
-    <w:p>
-      <w:pPr>
-        <w:pStyle w:val="ListParagraph"/>
-        <w:numPr>
-          <w:ilvl w:val="0"/>
-          <w:numId w:val="12"/>
-        </w:numPr>
-      </w:pPr>
-      <w:r>
-        <w:t xml:space="preserve">☐ '도달', '심화 이수', '사업 통합' 등 성과 지표의 정의와 기준일 정리</w:t>
-      </w:r>
-    </w:p>
-    <w:p>
-      <w:pPr>
-        <w:pStyle w:val="ListParagraph"/>
-        <w:numPr>
-          <w:ilvl w:val="0"/>
-          <w:numId w:val="12"/>
-        </w:numPr>
-      </w:pPr>
-      <w:r>
-        <w:t xml:space="preserve">☐ AIM ASEAN 목표(10만 곳) 확정과 지역 누적 실적 확보, AI Ready ASEAN 2단계와 AIM ASEAN의 동티모르 포함 여부 확인</w:t>
-      </w:r>
-    </w:p>
-    <w:p>
-      <w:pPr>
-        <w:pStyle w:val="ListParagraph"/>
-        <w:numPr>
-          <w:ilvl w:val="0"/>
-          <w:numId w:val="12"/>
-        </w:numPr>
-      </w:pPr>
-      <w:r>
-        <w:t xml:space="preserve">☐ 필리핀·인도네시아 Convening 내부 보고서 확보</w:t>
-      </w:r>
-    </w:p>
-    <w:p>
-      <w:pPr>
-        <w:pStyle w:val="ListParagraph"/>
-        <w:numPr>
-          <w:ilvl w:val="0"/>
-          <w:numId w:val="12"/>
-        </w:numPr>
-      </w:pPr>
-      <w:r>
-        <w:t xml:space="preserve">☐ CIIS 발송일·의제·모더레이터 확인</w:t>
-      </w:r>
-    </w:p>
-    <w:p>
-      <w:pPr>
-        <w:pStyle w:val="ListParagraph"/>
-        <w:numPr>
-          <w:ilvl w:val="0"/>
-          <w:numId w:val="12"/>
-        </w:numPr>
-      </w:pPr>
-      <w:r>
-        <w:t xml:space="preserve">☐ ASEAN 사무국 관련 부서와 SOM-ED·ACCMSME 의장국에 방문 목적과 CIIS 발언 요지 사전 공유</w:t>
-      </w:r>
-    </w:p>
-    <w:p>
-      <w:pPr>
-        <w:pStyle w:val="Heading2"/>
-      </w:pPr>
-      <w:r>
-        <w:t xml:space="preserve">부록: 출처</w:t>
-      </w:r>
-    </w:p>
-    <w:p>
-      <w:pPr/>
-      <w:r>
-        <w:t xml:space="preserve">본문에 쓴 사실의 출처다. 공개 자료는 2026년 10월 14일 기준이며, 대외 인용 전에는 원문과 대조한다. 싱가포르 Convening 자료는 현지 이행 파트너의 내부 보고서이므로 공개 범위를 확인한 뒤 인용한다. 중국 관영 매체가 유일한 출처인 수치(응용협력센터 실적, 사례집)와 플랫폼·기업 조사(Lazada–Kantar)는 출처를 밝혀 인용한다.</w:t>
-      </w:r>
-    </w:p>
-    <w:p>
-      <w:pPr/>
-      <w:r>
-        <w:rPr>
-          <w:b/>
-        </w:rPr>
-        <w:t xml:space="preserve">ASEAN–중국 AI 합의·기관</w:t>
-      </w:r>
-    </w:p>
-    <w:p>
-      <w:pPr>
-        <w:pStyle w:val="ListParagraph"/>
-        <w:numPr>
-          <w:ilvl w:val="0"/>
-          <w:numId w:val="13"/>
         </w:numPr>
       </w:pPr>
       <w:hyperlink r:id="rId3" w:history="1">
@@ -6960,7 +6060,7 @@
         <w:pStyle w:val="ListParagraph"/>
         <w:numPr>
           <w:ilvl w:val="0"/>
-          <w:numId w:val="13"/>
+          <w:numId w:val="12"/>
         </w:numPr>
       </w:pPr>
       <w:hyperlink r:id="rId4" w:history="1">
@@ -6991,7 +6091,7 @@
         <w:pStyle w:val="ListParagraph"/>
         <w:numPr>
           <w:ilvl w:val="0"/>
-          <w:numId w:val="13"/>
+          <w:numId w:val="12"/>
         </w:numPr>
       </w:pPr>
       <w:hyperlink r:id="rId11" w:history="1">
@@ -7033,7 +6133,7 @@
         <w:pStyle w:val="ListParagraph"/>
         <w:numPr>
           <w:ilvl w:val="0"/>
-          <w:numId w:val="13"/>
+          <w:numId w:val="12"/>
         </w:numPr>
       </w:pPr>
       <w:hyperlink r:id="rId14" w:history="1">
@@ -7061,7 +6161,7 @@
         <w:pStyle w:val="ListParagraph"/>
         <w:numPr>
           <w:ilvl w:val="0"/>
-          <w:numId w:val="13"/>
+          <w:numId w:val="12"/>
         </w:numPr>
       </w:pPr>
       <w:hyperlink r:id="rId16" w:history="1">
@@ -7125,7 +6225,7 @@
         <w:pStyle w:val="ListParagraph"/>
         <w:numPr>
           <w:ilvl w:val="0"/>
-          <w:numId w:val="13"/>
+          <w:numId w:val="12"/>
         </w:numPr>
       </w:pPr>
       <w:hyperlink r:id="rId21" w:history="1">
@@ -7164,7 +6264,7 @@
         <w:pStyle w:val="ListParagraph"/>
         <w:numPr>
           <w:ilvl w:val="0"/>
-          <w:numId w:val="13"/>
+          <w:numId w:val="12"/>
         </w:numPr>
       </w:pPr>
       <w:r>
@@ -7215,7 +6315,7 @@
         <w:pStyle w:val="ListParagraph"/>
         <w:numPr>
           <w:ilvl w:val="0"/>
-          <w:numId w:val="14"/>
+          <w:numId w:val="13"/>
         </w:numPr>
       </w:pPr>
       <w:hyperlink r:id="rId7" w:history="1">
@@ -7246,7 +6346,7 @@
         <w:pStyle w:val="ListParagraph"/>
         <w:numPr>
           <w:ilvl w:val="0"/>
-          <w:numId w:val="14"/>
+          <w:numId w:val="13"/>
         </w:numPr>
       </w:pPr>
       <w:hyperlink r:id="rId28" w:history="1">
@@ -7277,7 +6377,7 @@
         <w:pStyle w:val="ListParagraph"/>
         <w:numPr>
           <w:ilvl w:val="0"/>
-          <w:numId w:val="14"/>
+          <w:numId w:val="13"/>
         </w:numPr>
       </w:pPr>
       <w:hyperlink r:id="rId30" w:history="1">
@@ -7297,7 +6397,7 @@
         <w:pStyle w:val="ListParagraph"/>
         <w:numPr>
           <w:ilvl w:val="0"/>
-          <w:numId w:val="14"/>
+          <w:numId w:val="13"/>
         </w:numPr>
       </w:pPr>
       <w:hyperlink r:id="rId31" w:history="1">
@@ -7328,7 +6428,7 @@
         <w:pStyle w:val="ListParagraph"/>
         <w:numPr>
           <w:ilvl w:val="0"/>
-          <w:numId w:val="14"/>
+          <w:numId w:val="13"/>
         </w:numPr>
       </w:pPr>
       <w:hyperlink r:id="rId33" w:history="1">
@@ -7368,7 +6468,7 @@
         <w:pStyle w:val="ListParagraph"/>
         <w:numPr>
           <w:ilvl w:val="0"/>
-          <w:numId w:val="15"/>
+          <w:numId w:val="14"/>
         </w:numPr>
       </w:pPr>
       <w:hyperlink r:id="rId35" w:history="1">
@@ -7399,7 +6499,7 @@
         <w:pStyle w:val="ListParagraph"/>
         <w:numPr>
           <w:ilvl w:val="0"/>
-          <w:numId w:val="15"/>
+          <w:numId w:val="14"/>
         </w:numPr>
       </w:pPr>
       <w:hyperlink r:id="rId6" w:history="1">
@@ -7419,7 +6519,7 @@
         <w:pStyle w:val="ListParagraph"/>
         <w:numPr>
           <w:ilvl w:val="0"/>
-          <w:numId w:val="15"/>
+          <w:numId w:val="14"/>
         </w:numPr>
       </w:pPr>
       <w:hyperlink r:id="rId36" w:history="1">
@@ -7447,7 +6547,7 @@
         <w:pStyle w:val="ListParagraph"/>
         <w:numPr>
           <w:ilvl w:val="0"/>
-          <w:numId w:val="15"/>
+          <w:numId w:val="14"/>
         </w:numPr>
       </w:pPr>
       <w:hyperlink r:id="rId38" w:history="1">
@@ -7476,7 +6576,7 @@
         <w:pStyle w:val="ListParagraph"/>
         <w:numPr>
           <w:ilvl w:val="0"/>
-          <w:numId w:val="16"/>
+          <w:numId w:val="15"/>
         </w:numPr>
       </w:pPr>
       <w:hyperlink r:id="rId39" w:history="1">
@@ -7518,7 +6618,7 @@
         <w:pStyle w:val="ListParagraph"/>
         <w:numPr>
           <w:ilvl w:val="0"/>
-          <w:numId w:val="16"/>
+          <w:numId w:val="15"/>
         </w:numPr>
       </w:pPr>
       <w:hyperlink r:id="rId42" w:history="1">
@@ -7549,7 +6649,7 @@
         <w:pStyle w:val="ListParagraph"/>
         <w:numPr>
           <w:ilvl w:val="0"/>
-          <w:numId w:val="16"/>
+          <w:numId w:val="15"/>
         </w:numPr>
       </w:pPr>
       <w:hyperlink r:id="rId44" w:history="1">
@@ -7588,7 +6688,7 @@
         <w:pStyle w:val="ListParagraph"/>
         <w:numPr>
           <w:ilvl w:val="0"/>
-          <w:numId w:val="16"/>
+          <w:numId w:val="15"/>
         </w:numPr>
       </w:pPr>
       <w:hyperlink r:id="rId47" w:history="1">
@@ -7605,7 +6705,7 @@
         <w:pStyle w:val="ListParagraph"/>
         <w:numPr>
           <w:ilvl w:val="0"/>
-          <w:numId w:val="16"/>
+          <w:numId w:val="15"/>
         </w:numPr>
       </w:pPr>
       <w:hyperlink r:id="rId48" w:history="1">
@@ -7634,7 +6734,7 @@
         <w:pStyle w:val="ListParagraph"/>
         <w:numPr>
           <w:ilvl w:val="0"/>
-          <w:numId w:val="17"/>
+          <w:numId w:val="16"/>
         </w:numPr>
       </w:pPr>
       <w:hyperlink r:id="rId49" w:history="1">
@@ -7684,7 +6784,7 @@
         <w:pStyle w:val="ListParagraph"/>
         <w:numPr>
           <w:ilvl w:val="0"/>
-          <w:numId w:val="17"/>
+          <w:numId w:val="16"/>
         </w:numPr>
       </w:pPr>
       <w:hyperlink r:id="rId53" w:history="1">
@@ -7712,7 +6812,7 @@
         <w:pStyle w:val="ListParagraph"/>
         <w:numPr>
           <w:ilvl w:val="0"/>
-          <w:numId w:val="17"/>
+          <w:numId w:val="16"/>
         </w:numPr>
       </w:pPr>
       <w:r>
@@ -7757,7 +6857,7 @@
         <w:pStyle w:val="ListParagraph"/>
         <w:numPr>
           <w:ilvl w:val="0"/>
-          <w:numId w:val="17"/>
+          <w:numId w:val="16"/>
         </w:numPr>
       </w:pPr>
       <w:hyperlink r:id="rId58" w:history="1">
@@ -7774,7 +6874,7 @@
         <w:pStyle w:val="ListParagraph"/>
         <w:numPr>
           <w:ilvl w:val="0"/>
-          <w:numId w:val="17"/>
+          <w:numId w:val="16"/>
         </w:numPr>
       </w:pPr>
       <w:hyperlink r:id="rId59" w:history="1">
@@ -7833,7 +6933,7 @@
         <w:pStyle w:val="ListParagraph"/>
         <w:numPr>
           <w:ilvl w:val="0"/>
-          <w:numId w:val="18"/>
+          <w:numId w:val="17"/>
         </w:numPr>
       </w:pPr>
       <w:r>
@@ -7845,7 +6945,7 @@
         <w:pStyle w:val="ListParagraph"/>
         <w:numPr>
           <w:ilvl w:val="0"/>
-          <w:numId w:val="18"/>
+          <w:numId w:val="17"/>
         </w:numPr>
       </w:pPr>
       <w:r>
@@ -8094,9 +7194,6 @@
     <w:abstractNumId w:val="0"/>
   </w:num>
   <w:num w:numId="17">
-    <w:abstractNumId w:val="0"/>
-  </w:num>
-  <w:num w:numId="18">
     <w:abstractNumId w:val="0"/>
   </w:num>
 </w:numbering>

</xml_diff>